<commit_message>
Removed extra comments, updated screenshots, built final submission files
</commit_message>
<xml_diff>
--- a/report/RMS_Database_Design.docx
+++ b/report/RMS_Database_Design.docx
@@ -60,7 +60,7 @@
           <w:sz w:val="22"/>
           <w:szCs w:val="22"/>
         </w:rPr>
-        <w:t xml:space="preserve">Version 2 · 27 October 2026</w:t>
+        <w:t xml:space="preserve">Version 3 · 28 October 2026</w:t>
       </w:r>
     </w:p>
     <w:tbl>
@@ -443,7 +443,7 @@
           <w:sz w:val="19"/>
           <w:szCs w:val="19"/>
         </w:rPr>
-        <w:t xml:space="preserve">Scope: this document covers the database (ER diagram, relational schemas, functional dependencies, normalization and integrity constraints). The SQL scripts in db/ implement it; their comments carry the same decision IDs.</w:t>
+        <w:t xml:space="preserve">Scope: this document covers the database (ER diagram, relational schemas, functional dependencies, normalization and integrity constraints). The SQL scripts in db/ implement it.</w:t>
       </w:r>
     </w:p>
     <w:p>
@@ -2231,7 +2231,7 @@
                 <w:sz w:val="18"/>
                 <w:szCs w:val="18"/>
               </w:rPr>
-              <w:t xml:space="preserve">Individual constraints: CHECK and keys, triggers, application rules</w:t>
+              <w:t xml:space="preserve">Individual constraints: keys and CHECK, cross-table rules checked by the application, other application rules</w:t>
             </w:r>
           </w:p>
         </w:tc>
@@ -2467,7 +2467,7 @@
         <w:spacing w:after="60"/>
       </w:pPr>
       <w:r>
-        <w:t xml:space="preserve">Enforce the approval rules in the database itself, so that no application bug can break them: no self-approval, approval within the manager's limit, a reason for every rejection, only valid status changes.</w:t>
+        <w:t xml:space="preserve">Enforce the approval rules: no self-approval and a reason for every rejection as CHECK constraints in the database; approval within the manager's limit and only valid status changes in the application, checked in the form and again in the API.</w:t>
       </w:r>
     </w:p>
     <w:p>
@@ -9156,7 +9156,7 @@
                 <w:sz w:val="18"/>
                 <w:szCs w:val="18"/>
               </w:rPr>
-              <w:t xml:space="preserve">A stored total kept up to date by triggers. It is faster to read, but it is redundant and one more thing that can go wrong.</w:t>
+              <w:t xml:space="preserve">A stored total kept up to date on every item change. It is faster to read, but it is redundant and one more thing that can go wrong.</w:t>
             </w:r>
           </w:p>
         </w:tc>
@@ -9753,7 +9753,7 @@
                 <w:sz w:val="18"/>
                 <w:szCs w:val="18"/>
               </w:rPr>
-              <w:t xml:space="preserve">It makes disjointness checkable: trigger T3 refuses a TRAVEL row for a claim whose claim_​type is MEDICAL.</w:t>
+              <w:t xml:space="preserve">It makes disjointness checkable: the application (rule T3) writes the details row only to the table that matches claim_​type, so a MEDICAL claim never gets a TRAVEL row.</w:t>
             </w:r>
           </w:p>
           <w:p>
@@ -10599,7 +10599,7 @@
                 <w:sz w:val="18"/>
                 <w:szCs w:val="18"/>
               </w:rPr>
-              <w:t xml:space="preserve">Each manager has an approval_​limit. A manager may approve a claim only if its total is within that limit (trigger T1).</w:t>
+              <w:t xml:space="preserve">Each manager has an approval_​limit. A manager may approve a claim only if its total is within that limit (rule T1, checked by the application).</w:t>
             </w:r>
           </w:p>
         </w:tc>
@@ -11630,7 +11630,7 @@
                 <w:sz w:val="18"/>
                 <w:szCs w:val="18"/>
               </w:rPr>
-              <w:t xml:space="preserve">employee.supervisor_​id NULL, foreign key to employee. A self-reference and longer cycles are refused by trigger T4.</w:t>
+              <w:t xml:space="preserve">employee.supervisor_​id NULL, foreign key to employee. A self-reference and longer cycles are refused by the application (rule T4).</w:t>
             </w:r>
           </w:p>
         </w:tc>
@@ -12652,7 +12652,7 @@
                 <w:sz w:val="18"/>
                 <w:szCs w:val="18"/>
               </w:rPr>
-              <w:t xml:space="preserve">The plan marked this question as settled but did not record the answer. This is our assumption; see Q1. If the team wants "supervisor only", it is one extra check in trigger T1, with no change to the tables.</w:t>
+              <w:t xml:space="preserve">The plan marked this question as settled but did not record the answer. This is our assumption; see Q1. If the team wants "supervisor only", it is one extra check in rule T1, with no change to the tables.</w:t>
             </w:r>
           </w:p>
         </w:tc>
@@ -13366,7 +13366,7 @@
                 <w:sz w:val="18"/>
                 <w:szCs w:val="18"/>
               </w:rPr>
-              <w:t xml:space="preserve">claim_​type (A6) states the type. Disjointness: trigger T3. Totality: the claim row, its subclass row and its items are inserted in one transaction (A1 in Section 11). MySQL has no assertions or deferred constraints, so the database alone cannot require a subclass row (§4.4.7, §4.4.8).</w:t>
+              <w:t xml:space="preserve">claim_​type (A6) states the type. Disjointness: rule T3, checked by the application. Totality: the claim row, its subclass row and its items are inserted in one transaction (A1 in Section 11). MySQL has no assertions or deferred constraints, so the database alone cannot require a subclass row (§4.4.7, §4.4.8).</w:t>
             </w:r>
           </w:p>
         </w:tc>
@@ -15910,7 +15910,7 @@
                 <w:sz w:val="18"/>
                 <w:szCs w:val="18"/>
               </w:rPr>
-              <w:t xml:space="preserve">With a separate table, every one of these crosses two tables and needs a trigger. Folding also saves a join on every claim screen.</w:t>
+              <w:t xml:space="preserve">With a separate table, every one of these crosses two tables and could no longer be a CHECK. Folding also saves a join on every claim screen.</w:t>
             </w:r>
           </w:p>
         </w:tc>
@@ -18074,7 +18074,7 @@
                 <w:sz w:val="17"/>
                 <w:szCs w:val="17"/>
               </w:rPr>
-              <w:t xml:space="preserve">FK → employee, RESTRICT (SUPERVISES, partial); T4</w:t>
+              <w:t xml:space="preserve">FK → employee, RESTRICT (SUPERVISES, partial); T4 (application)</w:t>
             </w:r>
           </w:p>
         </w:tc>
@@ -20182,7 +20182,7 @@
                 <w:sz w:val="17"/>
                 <w:szCs w:val="17"/>
               </w:rPr>
-              <w:t xml:space="preserve">C5; default SUBMITTED; T1</w:t>
+              <w:t xml:space="preserve">C5; default SUBMITTED; T1 (application)</w:t>
             </w:r>
           </w:p>
         </w:tc>
@@ -23268,7 +23268,7 @@
                 <w:sz w:val="17"/>
                 <w:szCs w:val="17"/>
               </w:rPr>
-              <w:t xml:space="preserve">T2: not after claim_​date</w:t>
+              <w:t xml:space="preserve">T2 (application): not after claim_​date</w:t>
             </w:r>
           </w:p>
         </w:tc>
@@ -26254,7 +26254,7 @@
         <w:spacing w:after="120" w:before="0"/>
       </w:pPr>
       <w:r>
-        <w:t xml:space="preserve">Every rule the data must obey, where it is enforced and why. C = declared in the table (key, NOT NULL or CHECK), T = trigger, A = application rule that the database cannot express.</w:t>
+        <w:t xml:space="preserve">Every rule the data must obey, where it is enforced and why. C = declared in the table (key, NOT NULL or CHECK). T = a rule that needs the old row, another row or another table, so it cannot be a CHECK in MySQL; the application checks it in the form and again in the API (K1). A = other application rules.</w:t>
       </w:r>
     </w:p>
     <w:p>
@@ -28290,7 +28290,7 @@
                 <w:sz w:val="16"/>
                 <w:szCs w:val="16"/>
               </w:rPr>
-              <w:t xml:space="preserve">reimbursement BEFORE INSERT, UPDATE: (a) a new claim starts as SUBMITTED, and only the moves in the status diagram are allowed; (b) applicant_​id, claim_​type and claim_​date never change, and a decision, once made, is never edited; (c) on approval the claim has at least one item and SUM(amount) ≤ the approver's approval_​limit</w:t>
+              <w:t xml:space="preserve">Claim workflow: (a) a new claim is always inserted as SUBMITTED, and only the moves in the status diagram are allowed; (b) applicant_​id, claim_​type and claim_​date never change, and a decision, once made, is never edited; (c) on approval the claim has at least one item and SUM(amount) ≤ the approver's approval_​limit</w:t>
             </w:r>
           </w:p>
         </w:tc>
@@ -28321,7 +28321,7 @@
                 <w:sz w:val="16"/>
                 <w:szCs w:val="16"/>
               </w:rPr>
-              <w:t xml:space="preserve">Trigger</w:t>
+              <w:t xml:space="preserve">Application (form + API)</w:t>
             </w:r>
           </w:p>
         </w:tc>
@@ -28352,7 +28352,7 @@
                 <w:sz w:val="16"/>
                 <w:szCs w:val="16"/>
               </w:rPr>
-              <w:t xml:space="preserve">Needs the old row (a, b) or other tables (c), so a CHECK cannot do it. Without the INSERT check a claim could be inserted already APPROVED and skip (c).</w:t>
+              <w:t xml:space="preserve">Needs the old row (a, b) or other tables (c), so a CHECK cannot do it. The API locks the claim and the manager row (FOR UPDATE) while it checks and saves the decision. There is no endpoint that edits a saved claim.</w:t>
             </w:r>
           </w:p>
         </w:tc>
@@ -28419,7 +28419,7 @@
                 <w:sz w:val="16"/>
                 <w:szCs w:val="16"/>
               </w:rPr>
-              <w:t xml:space="preserve">expense_​item BEFORE INSERT, UPDATE, DELETE: the claim must still be SUBMITTED, and expense_​date ≤ claim_​date</w:t>
+              <w:t xml:space="preserve">Expense items: expense_​date ≤ claim_​date, and items cannot change once saved</w:t>
             </w:r>
           </w:p>
         </w:tc>
@@ -28450,7 +28450,7 @@
                 <w:sz w:val="16"/>
                 <w:szCs w:val="16"/>
               </w:rPr>
-              <w:t xml:space="preserve">Trigger</w:t>
+              <w:t xml:space="preserve">Application (form + API)</w:t>
             </w:r>
           </w:p>
         </w:tc>
@@ -28481,7 +28481,7 @@
                 <w:sz w:val="16"/>
                 <w:szCs w:val="16"/>
               </w:rPr>
-              <w:t xml:space="preserve">Items are frozen once a manager has decided; otherwise the approved total could change afterwards.</w:t>
+              <w:t xml:space="preserve">claim_​date is in another table. The API offers no way to edit or delete a saved item, so the total a manager approved cannot change afterwards.</w:t>
             </w:r>
           </w:p>
         </w:tc>
@@ -28548,7 +28548,7 @@
                 <w:sz w:val="16"/>
                 <w:szCs w:val="16"/>
               </w:rPr>
-              <w:t xml:space="preserve">travel_​ / medical_​ / business_​reimbursement BEFORE INSERT: the parent's claim_​type matches the table</w:t>
+              <w:t xml:space="preserve">The details row goes into the table that matches claim_​type</w:t>
             </w:r>
           </w:p>
         </w:tc>
@@ -28579,7 +28579,7 @@
                 <w:sz w:val="16"/>
                 <w:szCs w:val="16"/>
               </w:rPr>
-              <w:t xml:space="preserve">Trigger</w:t>
+              <w:t xml:space="preserve">Application (API)</w:t>
             </w:r>
           </w:p>
         </w:tc>
@@ -28610,7 +28610,7 @@
                 <w:sz w:val="16"/>
                 <w:szCs w:val="16"/>
               </w:rPr>
-              <w:t xml:space="preserve">Disjointness of the claim specialization (S2).</w:t>
+              <w:t xml:space="preserve">Disjointness of the claim specialization (S2). The claim and its one details row are inserted in the same transaction (A1).</w:t>
             </w:r>
           </w:p>
         </w:tc>
@@ -28677,7 +28677,7 @@
                 <w:sz w:val="16"/>
                 <w:szCs w:val="16"/>
               </w:rPr>
-              <w:t xml:space="preserve">employee BEFORE INSERT, UPDATE: supervisor_​id is not the employee and not one of their subordinates, at any depth</w:t>
+              <w:t xml:space="preserve">supervisor_​id is not the employee and not one of their subordinates, at any depth</w:t>
             </w:r>
           </w:p>
         </w:tc>
@@ -28708,7 +28708,7 @@
                 <w:sz w:val="16"/>
                 <w:szCs w:val="16"/>
               </w:rPr>
-              <w:t xml:space="preserve">Trigger</w:t>
+              <w:t xml:space="preserve">Application (form + API)</w:t>
             </w:r>
           </w:p>
         </w:tc>
@@ -28739,7 +28739,7 @@
                 <w:sz w:val="16"/>
                 <w:szCs w:val="16"/>
               </w:rPr>
-              <w:t xml:space="preserve">No supervision cycles. MySQL does not allow an AUTO_​INCREMENT column in a CHECK, so even the self-reference needs the trigger.</w:t>
+              <w:t xml:space="preserve">No supervision cycles: needs a walk up the reporting tree. The form disables supervisors that would create a cycle; the API locks the employee rows and checks again.</w:t>
             </w:r>
           </w:p>
         </w:tc>
@@ -29813,7 +29813,7 @@
                 <w:sz w:val="16"/>
                 <w:szCs w:val="16"/>
               </w:rPr>
-              <w:t xml:space="preserve">Reassign subordinates first. T4 reads this column, and keeping it RESTRICT avoids silent changes to the reporting tree.</w:t>
+              <w:t xml:space="preserve">Reassign subordinates first. T4 checks this column, and keeping it RESTRICT avoids silent changes to the reporting tree.</w:t>
             </w:r>
           </w:p>
         </w:tc>
@@ -30417,7 +30417,7 @@
           <w:sz w:val="18"/>
           <w:szCs w:val="18"/>
         </w:rPr>
-        <w:t xml:space="preserve">Figure 3. Allowed status changes. Trigger T1 rejects every other change, for example APPROVED → SUBMITTED or REJECTED → PAID.</w:t>
+        <w:t xml:space="preserve">Figure 3. Allowed status changes. The application (rule T1) refuses every other change, for example APPROVED → SUBMITTED or REJECTED → PAID.</w:t>
       </w:r>
     </w:p>
     <w:p>
@@ -30435,7 +30435,7 @@
         <w:keepNext/>
       </w:pPr>
       <w:r>
-        <w:t xml:space="preserve">K1  CHECK for rules on one row, triggers for rules across rows or tables</w:t>
+        <w:t xml:space="preserve">K1  CHECK for rules on one row; the application checks rules across rows or tables</w:t>
       </w:r>
     </w:p>
     <w:tbl>
@@ -30517,7 +30517,7 @@
                 <w:sz w:val="18"/>
                 <w:szCs w:val="18"/>
               </w:rPr>
-              <w:t xml:space="preserve">Single-row rules are CHECK constraints (C5 to C14). Rules that need another row or another table are BEFORE triggers (T1 to T4).</w:t>
+              <w:t xml:space="preserve">Single-row rules are CHECK constraints (C5 to C14). Rules that need the old row, another row or another table (T1 to T4) are checked by the application, twice: in the browser form, so the user sees the problem before submitting, and again in the API, inside the transaction that writes the data. Both use the same code (shared/validation.mjs). The database has no triggers.</w:t>
             </w:r>
           </w:p>
         </w:tc>
@@ -30585,7 +30585,157 @@
                 <w:sz w:val="18"/>
                 <w:szCs w:val="18"/>
               </w:rPr>
-              <w:t xml:space="preserve">A CHECK is declarative and cannot be bypassed. Standard SQL allows subqueries in CHECK, but MySQL does not, and it has no assertions (§4.4.8). Triggers are the textbook's answer for such rules (§5.3.1).</w:t>
+              <w:t xml:space="preserve">A CHECK is declarative and cannot be bypassed, so every rule that fits in one row is a CHECK. Standard SQL allows subqueries in CHECK, but MySQL does not, and it has no assertions (§4.4.8), so T1 to T4 cannot be declared in the schema.</w:t>
+            </w:r>
+          </w:p>
+          <w:p>
+            <w:pPr>
+              <w:spacing w:after="40"/>
+            </w:pPr>
+            <w:r>
+              <w:rPr>
+                <w:b w:val="false"/>
+                <w:bCs w:val="false"/>
+                <w:sz w:val="18"/>
+                <w:szCs w:val="18"/>
+              </w:rPr>
+              <w:t xml:space="preserve">The database-side alternative is triggers (§5.3). They were not part of our course, so we keep these rules in application code that we wrote and can explain. One shared module means the form and the API can never disagree about a rule.</w:t>
+            </w:r>
+          </w:p>
+        </w:tc>
+      </w:tr>
+      <w:tr>
+        <w:trPr>
+          <w:cantSplit/>
+        </w:trPr>
+        <w:tc>
+          <w:tcPr>
+            <w:tcW w:type="dxa" w:w="2120"/>
+            <w:tcBorders>
+              <w:top w:val="single" w:color="C9D1DC" w:sz="4"/>
+              <w:left w:val="single" w:color="C9D1DC" w:sz="4"/>
+              <w:bottom w:val="single" w:color="C9D1DC" w:sz="4"/>
+              <w:right w:val="single" w:color="C9D1DC" w:sz="4"/>
+            </w:tcBorders>
+            <w:shd w:fill="F5F7FA" w:color="auto" w:val="clear"/>
+            <w:tcMar>
+              <w:top w:type="dxa" w:w="60"/>
+              <w:left w:type="dxa" w:w="100"/>
+              <w:bottom w:type="dxa" w:w="60"/>
+              <w:right w:type="dxa" w:w="100"/>
+            </w:tcMar>
+          </w:tcPr>
+          <w:p>
+            <w:pPr>
+              <w:spacing w:after="40"/>
+            </w:pPr>
+            <w:r>
+              <w:rPr>
+                <w:b/>
+                <w:bCs/>
+                <w:sz w:val="18"/>
+                <w:szCs w:val="18"/>
+              </w:rPr>
+              <w:t xml:space="preserve">Concurrency</w:t>
+            </w:r>
+          </w:p>
+        </w:tc>
+        <w:tc>
+          <w:tcPr>
+            <w:tcW w:type="dxa" w:w="7518"/>
+            <w:tcBorders>
+              <w:top w:val="single" w:color="C9D1DC" w:sz="4"/>
+              <w:left w:val="single" w:color="C9D1DC" w:sz="4"/>
+              <w:bottom w:val="single" w:color="C9D1DC" w:sz="4"/>
+              <w:right w:val="single" w:color="C9D1DC" w:sz="4"/>
+            </w:tcBorders>
+            <w:tcMar>
+              <w:top w:type="dxa" w:w="60"/>
+              <w:left w:type="dxa" w:w="100"/>
+              <w:bottom w:type="dxa" w:w="60"/>
+              <w:right w:type="dxa" w:w="100"/>
+            </w:tcMar>
+          </w:tcPr>
+          <w:p>
+            <w:pPr>
+              <w:spacing w:after="40"/>
+            </w:pPr>
+            <w:r>
+              <w:rPr>
+                <w:b w:val="false"/>
+                <w:bCs w:val="false"/>
+                <w:sz w:val="18"/>
+                <w:szCs w:val="18"/>
+              </w:rPr>
+              <w:t xml:space="preserve">The API reads the rows a rule depends on with SELECT … FOR UPDATE inside the transaction (§4.3, §18.8.3). Two managers deciding the same claim at the same moment therefore cannot both succeed, and two supervisor changes cannot together create a cycle.</w:t>
+            </w:r>
+          </w:p>
+        </w:tc>
+      </w:tr>
+      <w:tr>
+        <w:trPr>
+          <w:cantSplit/>
+        </w:trPr>
+        <w:tc>
+          <w:tcPr>
+            <w:tcW w:type="dxa" w:w="2120"/>
+            <w:tcBorders>
+              <w:top w:val="single" w:color="C9D1DC" w:sz="4"/>
+              <w:left w:val="single" w:color="C9D1DC" w:sz="4"/>
+              <w:bottom w:val="single" w:color="C9D1DC" w:sz="4"/>
+              <w:right w:val="single" w:color="C9D1DC" w:sz="4"/>
+            </w:tcBorders>
+            <w:shd w:fill="F5F7FA" w:color="auto" w:val="clear"/>
+            <w:tcMar>
+              <w:top w:type="dxa" w:w="60"/>
+              <w:left w:type="dxa" w:w="100"/>
+              <w:bottom w:type="dxa" w:w="60"/>
+              <w:right w:type="dxa" w:w="100"/>
+            </w:tcMar>
+          </w:tcPr>
+          <w:p>
+            <w:pPr>
+              <w:spacing w:after="40"/>
+            </w:pPr>
+            <w:r>
+              <w:rPr>
+                <w:b/>
+                <w:bCs/>
+                <w:sz w:val="18"/>
+                <w:szCs w:val="18"/>
+              </w:rPr>
+              <w:t xml:space="preserve">Cost</w:t>
+            </w:r>
+          </w:p>
+        </w:tc>
+        <w:tc>
+          <w:tcPr>
+            <w:tcW w:type="dxa" w:w="7518"/>
+            <w:tcBorders>
+              <w:top w:val="single" w:color="C9D1DC" w:sz="4"/>
+              <w:left w:val="single" w:color="C9D1DC" w:sz="4"/>
+              <w:bottom w:val="single" w:color="C9D1DC" w:sz="4"/>
+              <w:right w:val="single" w:color="C9D1DC" w:sz="4"/>
+            </w:tcBorders>
+            <w:tcMar>
+              <w:top w:type="dxa" w:w="60"/>
+              <w:left w:type="dxa" w:w="100"/>
+              <w:bottom w:type="dxa" w:w="60"/>
+              <w:right w:type="dxa" w:w="100"/>
+            </w:tcMar>
+          </w:tcPr>
+          <w:p>
+            <w:pPr>
+              <w:spacing w:after="40"/>
+            </w:pPr>
+            <w:r>
+              <w:rPr>
+                <w:b w:val="false"/>
+                <w:bCs w:val="false"/>
+                <w:sz w:val="18"/>
+                <w:szCs w:val="18"/>
+              </w:rPr>
+              <w:t xml:space="preserve">Only the application enforces T1 to T4. A statement typed directly into MySQL could break them, so data is changed only through the application; the application's database user (03_​app_​user.sql) has no rights to change the schema.</w:t>
             </w:r>
           </w:p>
         </w:tc>
@@ -30820,7 +30970,7 @@
                 <w:sz w:val="18"/>
                 <w:szCs w:val="18"/>
               </w:rPr>
-              <w:t xml:space="preserve">A rule such as "every claim has at least one item" can only be checked after all rows are inserted. That needs a deferred constraint or an assertion (§4.4.7), and MySQL has neither. Trigger T1 is the safety net: a claim with no items can never be approved.</w:t>
+              <w:t xml:space="preserve">A rule such as "every claim has at least one item" can only be checked after all rows are inserted. That needs a deferred constraint or an assertion (§4.4.7), and MySQL has neither. Rule T1 is the safety net: the application never approves a claim with no items.</w:t>
             </w:r>
           </w:p>
         </w:tc>
@@ -32255,7 +32405,7 @@
                 <w:sz w:val="17"/>
                 <w:szCs w:val="17"/>
               </w:rPr>
-              <w:t xml:space="preserve">A BEFORE DELETE trigger allowing it only in SUBMITTED</w:t>
+              <w:t xml:space="preserve">A delete endpoint that allows it only while SUBMITTED</w:t>
             </w:r>
           </w:p>
         </w:tc>
@@ -32409,7 +32559,7 @@
         <w:spacing w:after="120" w:before="0"/>
       </w:pPr>
       <w:r>
-        <w:t xml:space="preserve">The assignment (references/DBMS Project.docx) asks for a report with seven items. All seven are covered here; File 1 (code and screenshots) follows after approval.</w:t>
+        <w:t xml:space="preserve">The assignment (references/DBMS Project.docx) asks for a report with seven items. All seven are covered here. File 1 holds the source code and the screenshots of the forms.</w:t>
       </w:r>
     </w:p>
     <w:tbl>
@@ -33282,7 +33432,7 @@
                 <w:sz w:val="18"/>
                 <w:szCs w:val="18"/>
               </w:rPr>
-              <w:t xml:space="preserve">db/, server/, client/; screenshots in report/screenshots/</w:t>
+              <w:t xml:space="preserve">db/, server/, client/, shared/; 15 screenshots in report/screenshots/</w:t>
             </w:r>
           </w:p>
         </w:tc>
@@ -33456,7 +33606,7 @@
         <w:spacing w:after="160" w:before="0"/>
       </w:pPr>
       <w:r>
-        <w:t xml:space="preserve">Disjoint: claim_type plus trigger T3. Total: one transaction inserts the claim and its subclass row; MySQL has no assertions or deferred constraints to do it in the schema (S2, K2).</w:t>
+        <w:t xml:space="preserve">Disjoint: claim_type, and the application writes only the matching details row (T3). Total: one transaction inserts the claim and its subclass row; MySQL has no assertions or deferred constraints to do it in the schema (S2, K2).</w:t>
       </w:r>
     </w:p>
     <w:p>
@@ -33582,7 +33732,28 @@
         <w:spacing w:after="160" w:before="0"/>
       </w:pPr>
       <w:r>
-        <w:t xml:space="preserve">Status transitions (needs the old row), the approval limit (needs another table), frozen items and type matching (other tables), and supervision cycles (recursive). Those are T1 to T4 (K1).</w:t>
+        <w:t xml:space="preserve">Status transitions (needs the old row), the approval limit (needs another table), frozen items and type matching (other tables), and supervision cycles (recursive). Those are T1 to T4. MySQL allows no subqueries in CHECK and has no assertions, so the application checks them, in the form and again in the API inside a locked transaction (K1).</w:t>
+      </w:r>
+    </w:p>
+    <w:p>
+      <w:pPr>
+        <w:keepNext/>
+        <w:spacing w:after="40" w:before="0"/>
+      </w:pPr>
+      <w:r>
+        <w:rPr>
+          <w:b/>
+          <w:bCs/>
+        </w:rPr>
+        <w:t xml:space="preserve">Why no triggers?</w:t>
+      </w:r>
+    </w:p>
+    <w:p>
+      <w:pPr>
+        <w:spacing w:after="160" w:before="0"/>
+      </w:pPr>
+      <w:r>
+        <w:t xml:space="preserve">Triggers were not part of our course. The cross-table rules (T1 to T4) are checked by one shared validation module, used by both the form and the API. The API checks again inside the transaction with SELECT … FOR UPDATE, so concurrent requests cannot slip past a rule (K1).</w:t>
       </w:r>
     </w:p>
     <w:p>

</xml_diff>